<commit_message>
Ship 0.3.0: scan a paper and complete it, keep Enhance from wiping the page, and select a sentence.
Co-authored-by: Cursor <cursoragent@cursor.com>
</commit_message>
<xml_diff>
--- a/assessment/Aaron-Grace-Superpower-Copywriter-Assessment.docx
+++ b/assessment/Aaron-Grace-Superpower-Copywriter-Assessment.docx
@@ -36,7 +36,7 @@
           <w:sz w:val="20"/>
           <w:szCs w:val="20"/>
         </w:rPr>
-        <w:t xml:space="preserve">Aaron Grace · Superpower Copywriter Assessment · Campaign for “Your annual physical isn’t enough.” · $349/year · 100+ biomarkers · two blood draws</w:t>
+        <w:t xml:space="preserve">Aaron Grace · Superpower Copywriter Assessment · Territory: “Your annual physical isn’t enough.” · $349/year · 100+ biomarkers · two blood draws</w:t>
       </w:r>
     </w:p>
     <w:p>
@@ -73,20 +73,41 @@
           <w:sz w:val="20"/>
           <w:szCs w:val="20"/>
         </w:rPr>
-        <w:t xml:space="preserve">150 words max. One direction.</w:t>
-      </w:r>
-    </w:p>
-    <w:p>
-      <w:pPr>
-        <w:spacing w:after="160"/>
-      </w:pPr>
-      <w:r>
-        <w:rPr>
-          <w:rFonts w:ascii="Calibri" w:cs="Calibri" w:eastAsia="Calibri" w:hAnsi="Calibri"/>
-          <w:sz w:val="22"/>
-          <w:szCs w:val="22"/>
-        </w:rPr>
-        <w:t xml:space="preserve">The annual physical is a pass/fail exam for people who already passed. Our audience isn’t sick. They’re health-conscious adults 35+ who eat well, train, take the supplements, and still walk out with the same sentence: you’re fine. Fine is a relief. Fine is also a dead end. It answers the only question the physical is built to ask — is something clinically wrong — and leaves the more useful question untouched: what’s actually happening in my body, and what do I do next? That’s the tension. Not fear. Not biohacking. The gap between feeling healthy and having a picture. Superpower doesn’t compete with the physical. It finishes the sentence the physical starts.</w:t>
+        <w:t xml:space="preserve">150 words max. One direction: punch “fine,” not the physician.</w:t>
+      </w:r>
+    </w:p>
+    <w:p>
+      <w:pPr>
+        <w:spacing w:after="160"/>
+      </w:pPr>
+      <w:r>
+        <w:rPr>
+          <w:rFonts w:ascii="Calibri" w:cs="Calibri" w:eastAsia="Calibri" w:hAnsi="Calibri"/>
+          <w:sz w:val="22"/>
+          <w:szCs w:val="22"/>
+        </w:rPr>
+        <w:t xml:space="preserve">The annual physical is a pass/fail exam for people who already passed. This audience isn’t sick. They’re 35 and up. They eat well, they train, they take the supplements, they show up for the checkup. Then they get the same sentence: you’re fine. Fine feels like a win. Fine is also where the useful conversation stops. The physical only asks if something is clinically wrong. It never answers the question they actually walked in with: what’s going on in my body, and what do I do next? That’s the tension. Not fear. Not biohacking. The gap between feeling healthy and having a picture. Superpower isn’t fighting the doctor. It finishes the sentence the physical starts.</w:t>
+      </w:r>
+    </w:p>
+    <w:p>
+      <w:pPr>
+        <w:spacing w:after="160"/>
+        <w:rPr>
+          <w:i/>
+          <w:iCs/>
+          <w:sz w:val="20"/>
+          <w:szCs w:val="20"/>
+        </w:rPr>
+      </w:pPr>
+      <w:r>
+        <w:rPr>
+          <w:rFonts w:ascii="Calibri" w:cs="Calibri" w:eastAsia="Calibri" w:hAnsi="Calibri"/>
+          <w:i/>
+          <w:iCs/>
+          <w:sz w:val="20"/>
+          <w:szCs w:val="20"/>
+        </w:rPr>
+        <w:t xml:space="preserve">118 words.</w:t>
       </w:r>
     </w:p>
     <w:p>
@@ -108,14 +129,35 @@
     <w:p>
       <w:pPr>
         <w:spacing w:after="160"/>
-      </w:pPr>
-      <w:r>
-        <w:rPr>
-          <w:rFonts w:ascii="Calibri" w:cs="Calibri" w:eastAsia="Calibri" w:hAnsi="Calibri"/>
-          <w:sz w:val="22"/>
-          <w:szCs w:val="22"/>
-        </w:rPr>
-        <w:t xml:space="preserve">You already do the work. You eat like you mean it, you train, you show up for the physical, and they tell you you’re fine. Months later you’re still guessing at the tiredness, still stacking supplements, still using a shrug like a plan. Superpower measures 100+ biomarkers in one blood draw, twice a year, then gives you a Superpower Health Action Plan and on-demand access to a care team. 60% of members said Superpower identified something previously missed or overlooked by a doctor — not because someone failed, but because a handful of markers was never a picture. Most companies stop at testing. We go further.</w:t>
+        <w:rPr>
+          <w:i/>
+          <w:iCs/>
+          <w:sz w:val="20"/>
+          <w:szCs w:val="20"/>
+        </w:rPr>
+      </w:pPr>
+      <w:r>
+        <w:rPr>
+          <w:rFonts w:ascii="Calibri" w:cs="Calibri" w:eastAsia="Calibri" w:hAnsi="Calibri"/>
+          <w:i/>
+          <w:iCs/>
+          <w:sz w:val="20"/>
+          <w:szCs w:val="20"/>
+        </w:rPr>
+        <w:t xml:space="preserve">5–7 sentences.</w:t>
+      </w:r>
+    </w:p>
+    <w:p>
+      <w:pPr>
+        <w:spacing w:after="160"/>
+      </w:pPr>
+      <w:r>
+        <w:rPr>
+          <w:rFonts w:ascii="Calibri" w:cs="Calibri" w:eastAsia="Calibri" w:hAnsi="Calibri"/>
+          <w:sz w:val="22"/>
+          <w:szCs w:val="22"/>
+        </w:rPr>
+        <w:t xml:space="preserve">You already do the work. You eat like you mean it, you train, you show up for the physical, and they tell you you’re fine. You leave feeling responsible — and still without a picture of what’s happening under that all-clear. Superpower tests 100+ biomarkers in one blood draw, twice a year, then gives you a Superpower Health Action Plan and on-demand access to a care team. 60% of members said Superpower identified something previously missed or overlooked by a doctor — not because someone failed, but because 10–15 markers was never a picture. Most companies stop at testing. We go further.</w:t>
       </w:r>
     </w:p>
     <w:p>
@@ -136,6 +178,27 @@
     </w:p>
     <w:p>
       <w:pPr>
+        <w:spacing w:after="160"/>
+        <w:rPr>
+          <w:i/>
+          <w:iCs/>
+          <w:sz w:val="20"/>
+          <w:szCs w:val="20"/>
+        </w:rPr>
+      </w:pPr>
+      <w:r>
+        <w:rPr>
+          <w:rFonts w:ascii="Calibri" w:cs="Calibri" w:eastAsia="Calibri" w:hAnsi="Calibri"/>
+          <w:i/>
+          <w:iCs/>
+          <w:sz w:val="20"/>
+          <w:szCs w:val="20"/>
+        </w:rPr>
+        <w:t xml:space="preserve">Same idea in every channel. Different job in each one.</w:t>
+      </w:r>
+    </w:p>
+    <w:p>
+      <w:pPr>
         <w:pStyle w:val="Heading2"/>
         <w:spacing w:after="120" w:before="280"/>
       </w:pPr>
@@ -160,33 +223,33 @@
           <w:sz w:val="22"/>
           <w:szCs w:val="22"/>
         </w:rPr>
-        <w:t xml:space="preserve">1. You’re fine. That’s the problem.</w:t>
-      </w:r>
-    </w:p>
-    <w:p>
-      <w:pPr>
-        <w:spacing w:after="160"/>
-      </w:pPr>
-      <w:r>
-        <w:rPr>
-          <w:rFonts w:ascii="Calibri" w:cs="Calibri" w:eastAsia="Calibri" w:hAnsi="Calibri"/>
-          <w:sz w:val="22"/>
-          <w:szCs w:val="22"/>
-        </w:rPr>
-        <w:t xml:space="preserve">2. Fine isn’t a picture.</w:t>
-      </w:r>
-    </w:p>
-    <w:p>
-      <w:pPr>
-        <w:spacing w:after="160"/>
-      </w:pPr>
-      <w:r>
-        <w:rPr>
-          <w:rFonts w:ascii="Calibri" w:cs="Calibri" w:eastAsia="Calibri" w:hAnsi="Calibri"/>
-          <w:sz w:val="22"/>
-          <w:szCs w:val="22"/>
-        </w:rPr>
-        <w:t xml:space="preserve">3. Your physical asked if something was wrong. You still don’t know what’s going on.</w:t>
+        <w:t xml:space="preserve">1. You’re fine. That’s the problem.  (Brand / film lockup)</w:t>
+      </w:r>
+    </w:p>
+    <w:p>
+      <w:pPr>
+        <w:spacing w:after="160"/>
+      </w:pPr>
+      <w:r>
+        <w:rPr>
+          <w:rFonts w:ascii="Calibri" w:cs="Calibri" w:eastAsia="Calibri" w:hAnsi="Calibri"/>
+          <w:sz w:val="22"/>
+          <w:szCs w:val="22"/>
+        </w:rPr>
+        <w:t xml:space="preserve">2. Your physical asked if something was wrong. You still don’t know what’s going on.  (LP / email)</w:t>
+      </w:r>
+    </w:p>
+    <w:p>
+      <w:pPr>
+        <w:spacing w:after="160"/>
+      </w:pPr>
+      <w:r>
+        <w:rPr>
+          <w:rFonts w:ascii="Calibri" w:cs="Calibri" w:eastAsia="Calibri" w:hAnsi="Calibri"/>
+          <w:sz w:val="22"/>
+          <w:szCs w:val="22"/>
+        </w:rPr>
+        <w:t xml:space="preserve">3. Your physical checked 10–15 markers. Superpower checks 100+.  (Performance. Specificity is the ad.)</w:t>
       </w:r>
     </w:p>
     <w:p>
@@ -228,20 +291,20 @@
           <w:sz w:val="22"/>
           <w:szCs w:val="22"/>
         </w:rPr>
-        <w:t xml:space="preserve">Open. Fluorescent exam room. Paper gown. The cuff inflates. A doctor, warm and automatic: “You’re fine.” Handshake. Parking lot.</w:t>
-      </w:r>
-    </w:p>
-    <w:p>
-      <w:pPr>
-        <w:spacing w:after="160"/>
-      </w:pPr>
-      <w:r>
-        <w:rPr>
-          <w:rFonts w:ascii="Calibri" w:cs="Calibri" w:eastAsia="Calibri" w:hAnsi="Calibri"/>
-          <w:sz w:val="22"/>
-          <w:szCs w:val="22"/>
-        </w:rPr>
-        <w:t xml:space="preserve">Life continues. Gym at 6. Groceries. A 3pm crash at the desk. A cabinet of supplements that never quite adds up.</w:t>
+        <w:t xml:space="preserve">Open · 0:00–0:08. Fluorescent exam room. Paper gown. The cuff inflates. A doctor, warm and automatic: “You’re fine.” Handshake. Parking lot. She folds a short printout like a receipt.</w:t>
+      </w:r>
+    </w:p>
+    <w:p>
+      <w:pPr>
+        <w:spacing w:after="160"/>
+      </w:pPr>
+      <w:r>
+        <w:rPr>
+          <w:rFonts w:ascii="Calibri" w:cs="Calibri" w:eastAsia="Calibri" w:hAnsi="Calibri"/>
+          <w:sz w:val="22"/>
+          <w:szCs w:val="22"/>
+        </w:rPr>
+        <w:t xml:space="preserve">Life · 0:08–0:18. Gym at 6. Real groceries. The cabinet of supplements. None of it looks like a person in trouble. It looks like a person who already did the work.</w:t>
       </w:r>
     </w:p>
     <w:p>
@@ -267,20 +330,20 @@
           <w:sz w:val="22"/>
           <w:szCs w:val="22"/>
         </w:rPr>
-        <w:t xml:space="preserve">Cut. One blood draw. Then 100+ biomarkers filling a dashboard. 17 health scores. A plan, not a shrug.</w:t>
-      </w:r>
-    </w:p>
-    <w:p>
-      <w:pPr>
-        <w:spacing w:after="160"/>
-      </w:pPr>
-      <w:r>
-        <w:rPr>
-          <w:rFonts w:ascii="Calibri" w:cs="Calibri" w:eastAsia="Calibri" w:hAnsi="Calibri"/>
-          <w:sz w:val="22"/>
-          <w:szCs w:val="22"/>
-        </w:rPr>
-        <w:t xml:space="preserve">VO. Superpower measures 100+ biomarkers. Twice a year. A Superpower Health Action Plan. On-demand access to a care team.</w:t>
+        <w:t xml:space="preserve">Turn · 0:18–0:32. One blood draw. Then a dashboard filling in: 100+ biomarkers. 17 health scores. Heart. Hormones. Thyroid. Inflammation. A plan, not a shrug.</w:t>
+      </w:r>
+    </w:p>
+    <w:p>
+      <w:pPr>
+        <w:spacing w:after="160"/>
+      </w:pPr>
+      <w:r>
+        <w:rPr>
+          <w:rFonts w:ascii="Calibri" w:cs="Calibri" w:eastAsia="Calibri" w:hAnsi="Calibri"/>
+          <w:sz w:val="22"/>
+          <w:szCs w:val="22"/>
+        </w:rPr>
+        <w:t xml:space="preserve">VO. Superpower tests 100+ biomarkers. Twice a year. A Superpower Health Action Plan. On-demand access to a care team.</w:t>
       </w:r>
     </w:p>
     <w:p>
@@ -306,33 +369,20 @@
           <w:sz w:val="22"/>
           <w:szCs w:val="22"/>
         </w:rPr>
-        <w:t xml:space="preserve">VO. Most companies stop at testing. We go further.</w:t>
-      </w:r>
-    </w:p>
-    <w:p>
-      <w:pPr>
-        <w:spacing w:after="160"/>
-      </w:pPr>
-      <w:r>
-        <w:rPr>
-          <w:rFonts w:ascii="Calibri" w:cs="Calibri" w:eastAsia="Calibri" w:hAnsi="Calibri"/>
-          <w:sz w:val="22"/>
-          <w:szCs w:val="22"/>
-        </w:rPr>
-        <w:t xml:space="preserve">Lockup. YOU’RE FINE. That’s the problem. Superpower. $349/year.</w:t>
-      </w:r>
-    </w:p>
-    <w:p>
-      <w:pPr>
-        <w:spacing w:after="160"/>
-      </w:pPr>
-      <w:r>
-        <w:rPr>
-          <w:rFonts w:ascii="Calibri" w:cs="Calibri" w:eastAsia="Calibri" w:hAnsi="Calibri"/>
-          <w:sz w:val="22"/>
-          <w:szCs w:val="22"/>
-        </w:rPr>
-        <w:t xml:space="preserve">CTA. Get 100+ biomarkers tested for $349</w:t>
+        <w:t xml:space="preserve">Close · 0:32–0:45. Same kitchen. She’s reading the plan, not the all-clear. VO: I didn’t need another all-clear. I needed to know what was going on. VO: Most companies stop at testing. We go further.</w:t>
+      </w:r>
+    </w:p>
+    <w:p>
+      <w:pPr>
+        <w:spacing w:after="160"/>
+      </w:pPr>
+      <w:r>
+        <w:rPr>
+          <w:rFonts w:ascii="Calibri" w:cs="Calibri" w:eastAsia="Calibri" w:hAnsi="Calibri"/>
+          <w:sz w:val="22"/>
+          <w:szCs w:val="22"/>
+        </w:rPr>
+        <w:t xml:space="preserve">Lockup. YOU’RE FINE. That’s the problem. Superpower. $349/year. HSA/FSA eligible. Get 100+ biomarkers tested for $349</w:t>
       </w:r>
     </w:p>
     <w:p>
@@ -374,7 +424,7 @@
           <w:sz w:val="22"/>
           <w:szCs w:val="22"/>
         </w:rPr>
-        <w:t xml:space="preserve">Subhead. Your annual physical was built to catch what’s already wrong. Superpower measures 100+ biomarkers — twice a year — and gives you a plan for what to do next. $349.</w:t>
+        <w:t xml:space="preserve">Subhead. Your annual physical was built to find what’s already wrong. Superpower tests 100+ biomarkers, twice a year, and gives you a plan for what to do next. $349/year. HSA/FSA eligible.</w:t>
       </w:r>
     </w:p>
     <w:p>
@@ -400,39 +450,143 @@
           <w:sz w:val="22"/>
           <w:szCs w:val="22"/>
         </w:rPr>
-        <w:t xml:space="preserve">Section 1 — What “fine” actually checked. A standard physical answers one question: is something clinically wrong. Superpower is for people who already passed that test and still want the rest of the picture. 100+ biomarkers in one blood draw. 17 health scores on the dashboard. Results in 5–10 business days. 2,000+ lab locations in 39 states.</w:t>
-      </w:r>
-    </w:p>
-    <w:p>
-      <w:pPr>
-        <w:spacing w:after="160"/>
-      </w:pPr>
-      <w:r>
-        <w:rPr>
-          <w:rFonts w:ascii="Calibri" w:cs="Calibri" w:eastAsia="Calibri" w:hAnsi="Calibri"/>
-          <w:sz w:val="22"/>
-          <w:szCs w:val="22"/>
-        </w:rPr>
-        <w:t xml:space="preserve">Section 2 — Then you do something with it. 93% of members rated their Superpower Health Action Plan as more useful or even life-changing compared to their yearly checkup. On-demand access to a care team. Personalized protocols. Two blood draws a year. HSA/FSA eligible. What could cost $15,000 elsewhere is $349.</w:t>
-      </w:r>
-    </w:p>
-    <w:p>
-      <w:pPr>
-        <w:spacing w:after="160"/>
-        <w:rPr>
-          <w:i/>
-          <w:iCs/>
-        </w:rPr>
-      </w:pPr>
-      <w:r>
-        <w:rPr>
-          <w:rFonts w:ascii="Calibri" w:cs="Calibri" w:eastAsia="Calibri" w:hAnsi="Calibri"/>
-          <w:i/>
-          <w:iCs/>
-          <w:sz w:val="22"/>
-          <w:szCs w:val="22"/>
-        </w:rPr>
-        <w:t xml:space="preserve">Cuts I made on purpose: marketplace, peptides, GRAIL, AI Concierge, biological age. This campaign has one job. Those belong to the next click, not the first sentence.</w:t>
+        <w:t xml:space="preserve">Section 1 — What “fine” actually checked</w:t>
+      </w:r>
+    </w:p>
+    <w:p>
+      <w:pPr>
+        <w:spacing w:after="160"/>
+      </w:pPr>
+      <w:r>
+        <w:rPr>
+          <w:rFonts w:ascii="Calibri" w:cs="Calibri" w:eastAsia="Calibri" w:hAnsi="Calibri"/>
+          <w:sz w:val="22"/>
+          <w:szCs w:val="22"/>
+        </w:rPr>
+        <w:t xml:space="preserve">A standard physical looks at 10–15 markers and asks one question: is something clinically wrong.</w:t>
+      </w:r>
+    </w:p>
+    <w:p>
+      <w:pPr>
+        <w:spacing w:after="160"/>
+      </w:pPr>
+      <w:r>
+        <w:rPr>
+          <w:rFonts w:ascii="Calibri" w:cs="Calibri" w:eastAsia="Calibri" w:hAnsi="Calibri"/>
+          <w:sz w:val="22"/>
+          <w:szCs w:val="22"/>
+        </w:rPr>
+        <w:t xml:space="preserve">If you already eat well, train, and got the all-clear, that question is answered. The useful one isn’t: what’s happening under the all-clear.</w:t>
+      </w:r>
+    </w:p>
+    <w:p>
+      <w:pPr>
+        <w:spacing w:after="160"/>
+      </w:pPr>
+      <w:r>
+        <w:rPr>
+          <w:rFonts w:ascii="Calibri" w:cs="Calibri" w:eastAsia="Calibri" w:hAnsi="Calibri"/>
+          <w:sz w:val="22"/>
+          <w:szCs w:val="22"/>
+        </w:rPr>
+        <w:t xml:space="preserve">Superpower tests 100+ biomarkers in one blood draw — heart, hormones, thyroid, metabolic health, nutrients, inflammation — then puts it on a dashboard with 17 health scores. Book at 2,000+ lab locations in 39 states. Results in 5–10 business days.</w:t>
+      </w:r>
+    </w:p>
+    <w:p>
+      <w:pPr>
+        <w:spacing w:after="160"/>
+      </w:pPr>
+      <w:r>
+        <w:rPr>
+          <w:rFonts w:ascii="Calibri" w:cs="Calibri" w:eastAsia="Calibri" w:hAnsi="Calibri"/>
+          <w:sz w:val="22"/>
+          <w:szCs w:val="22"/>
+        </w:rPr>
+        <w:t xml:space="preserve">This isn’t a replacement for your physical. It’s the rest of the picture.</w:t>
+      </w:r>
+    </w:p>
+    <w:p>
+      <w:pPr>
+        <w:spacing w:after="160"/>
+      </w:pPr>
+      <w:r>
+        <w:rPr>
+          <w:rFonts w:ascii="Calibri" w:cs="Calibri" w:eastAsia="Calibri" w:hAnsi="Calibri"/>
+          <w:sz w:val="22"/>
+          <w:szCs w:val="22"/>
+        </w:rPr>
+        <w:t xml:space="preserve">Section 2 — Then you do something with it</w:t>
+      </w:r>
+    </w:p>
+    <w:p>
+      <w:pPr>
+        <w:spacing w:after="160"/>
+      </w:pPr>
+      <w:r>
+        <w:rPr>
+          <w:rFonts w:ascii="Calibri" w:cs="Calibri" w:eastAsia="Calibri" w:hAnsi="Calibri"/>
+          <w:sz w:val="22"/>
+          <w:szCs w:val="22"/>
+        </w:rPr>
+        <w:t xml:space="preserve">Your yearly checkup told you you were fine. Then what?</w:t>
+      </w:r>
+    </w:p>
+    <w:p>
+      <w:pPr>
+        <w:spacing w:after="160"/>
+      </w:pPr>
+      <w:r>
+        <w:rPr>
+          <w:rFonts w:ascii="Calibri" w:cs="Calibri" w:eastAsia="Calibri" w:hAnsi="Calibri"/>
+          <w:sz w:val="22"/>
+          <w:szCs w:val="22"/>
+        </w:rPr>
+        <w:t xml:space="preserve">93% of members rated their Superpower Health Action Plan as more useful or even life-changing compared to their yearly checkup.</w:t>
+      </w:r>
+    </w:p>
+    <w:p>
+      <w:pPr>
+        <w:spacing w:after="160"/>
+      </w:pPr>
+      <w:r>
+        <w:rPr>
+          <w:rFonts w:ascii="Calibri" w:cs="Calibri" w:eastAsia="Calibri" w:hAnsi="Calibri"/>
+          <w:sz w:val="22"/>
+          <w:szCs w:val="22"/>
+        </w:rPr>
+        <w:t xml:space="preserve">You get personalized protocols, on-demand access to a care team, and a second draw so you’re not making a year of decisions off one snapshot. What could cost $15,000 elsewhere is $349. HSA/FSA eligible.</w:t>
+      </w:r>
+    </w:p>
+    <w:p>
+      <w:pPr>
+        <w:spacing w:after="160"/>
+      </w:pPr>
+      <w:r>
+        <w:rPr>
+          <w:rFonts w:ascii="Calibri" w:cs="Calibri" w:eastAsia="Calibri" w:hAnsi="Calibri"/>
+          <w:sz w:val="22"/>
+          <w:szCs w:val="22"/>
+        </w:rPr>
+        <w:t xml:space="preserve">Most companies stop at testing. We go further.</w:t>
+      </w:r>
+    </w:p>
+    <w:p>
+      <w:pPr>
+        <w:spacing w:after="160"/>
+        <w:rPr>
+          <w:i/>
+          <w:iCs/>
+        </w:rPr>
+      </w:pPr>
+      <w:r>
+        <w:rPr>
+          <w:rFonts w:ascii="Calibri" w:cs="Calibri" w:eastAsia="Calibri" w:hAnsi="Calibri"/>
+          <w:i/>
+          <w:iCs/>
+          <w:sz w:val="22"/>
+          <w:szCs w:val="22"/>
+        </w:rPr>
+        <w:t xml:space="preserve">Cuts on purpose: marketplace, biological age, 1,000+ conditions, energy/sleep/focus stats, AI Concierge. This page has one job. Those belong to the next click, not the first sentence.</w:t>
       </w:r>
     </w:p>
     <w:p>
@@ -454,40 +608,61 @@
     <w:p>
       <w:pPr>
         <w:spacing w:after="160"/>
-      </w:pPr>
-      <w:r>
-        <w:rPr>
-          <w:rFonts w:ascii="Calibri" w:cs="Calibri" w:eastAsia="Calibri" w:hAnsi="Calibri"/>
-          <w:sz w:val="22"/>
-          <w:szCs w:val="22"/>
-        </w:rPr>
-        <w:t xml:space="preserve">1. Hook: Your physical said you were fine. How many markers did they actually look at? Body: Superpower measures 100+ biomarkers in one blood draw, twice a year. $349. CTA: Get 100+ biomarkers tested for $349</w:t>
-      </w:r>
-    </w:p>
-    <w:p>
-      <w:pPr>
-        <w:spacing w:after="160"/>
-      </w:pPr>
-      <w:r>
-        <w:rPr>
-          <w:rFonts w:ascii="Calibri" w:cs="Calibri" w:eastAsia="Calibri" w:hAnsi="Calibri"/>
-          <w:sz w:val="22"/>
-          <w:szCs w:val="22"/>
-        </w:rPr>
-        <w:t xml:space="preserve">2. Hook: Sleeping 8 hours and still feeling tired? Body: 75% of members reported improved sleep. CTA: Get 100+ biomarkers tested for $349</w:t>
-      </w:r>
-    </w:p>
-    <w:p>
-      <w:pPr>
-        <w:spacing w:after="160"/>
-      </w:pPr>
-      <w:r>
-        <w:rPr>
-          <w:rFonts w:ascii="Calibri" w:cs="Calibri" w:eastAsia="Calibri" w:hAnsi="Calibri"/>
-          <w:sz w:val="22"/>
-          <w:szCs w:val="22"/>
-        </w:rPr>
-        <w:t xml:space="preserve">3. Hook: You eat well. You train. You still don’t have the numbers. Body: 100+ biomarkers. Two blood draws a year. A Superpower Health Action Plan. CTA: Start with a blood draw</w:t>
+        <w:rPr>
+          <w:i/>
+          <w:iCs/>
+          <w:sz w:val="20"/>
+          <w:szCs w:val="20"/>
+        </w:rPr>
+      </w:pPr>
+      <w:r>
+        <w:rPr>
+          <w:rFonts w:ascii="Calibri" w:cs="Calibri" w:eastAsia="Calibri" w:hAnsi="Calibri"/>
+          <w:i/>
+          <w:iCs/>
+          <w:sz w:val="20"/>
+          <w:szCs w:val="20"/>
+        </w:rPr>
+        <w:t xml:space="preserve">Hook first. Offer or verbatim stat second. No competitor names.</w:t>
+      </w:r>
+    </w:p>
+    <w:p>
+      <w:pPr>
+        <w:spacing w:after="160"/>
+      </w:pPr>
+      <w:r>
+        <w:rPr>
+          <w:rFonts w:ascii="Calibri" w:cs="Calibri" w:eastAsia="Calibri" w:hAnsi="Calibri"/>
+          <w:sz w:val="22"/>
+          <w:szCs w:val="22"/>
+        </w:rPr>
+        <w:t xml:space="preserve">1. Hook: Your physical said you were fine. How many markers did they actually look at? Body: Superpower tests 100+ biomarkers in one blood draw, twice a year. $349. CTA: Get 100+ biomarkers tested for $349</w:t>
+      </w:r>
+    </w:p>
+    <w:p>
+      <w:pPr>
+        <w:spacing w:after="160"/>
+      </w:pPr>
+      <w:r>
+        <w:rPr>
+          <w:rFonts w:ascii="Calibri" w:cs="Calibri" w:eastAsia="Calibri" w:hAnsi="Calibri"/>
+          <w:sz w:val="22"/>
+          <w:szCs w:val="22"/>
+        </w:rPr>
+        <w:t xml:space="preserve">2. Hook: If your last physical checked 100+ biomarkers, keep scrolling. Body: It didn’t. Superpower does. Twice a year. $349. HSA/FSA eligible. CTA: Get 100+ biomarkers tested for $349</w:t>
+      </w:r>
+    </w:p>
+    <w:p>
+      <w:pPr>
+        <w:spacing w:after="160"/>
+      </w:pPr>
+      <w:r>
+        <w:rPr>
+          <w:rFonts w:ascii="Calibri" w:cs="Calibri" w:eastAsia="Calibri" w:hAnsi="Calibri"/>
+          <w:sz w:val="22"/>
+          <w:szCs w:val="22"/>
+        </w:rPr>
+        <w:t xml:space="preserve">3. Hook: You eat well. You train. You still don’t have the numbers. Body: 100+ biomarkers. Two blood draws a year. A Superpower Health Action Plan. CTA: Get 100+ biomarkers tested for $349</w:t>
       </w:r>
     </w:p>
     <w:p>
@@ -513,7 +688,7 @@
           <w:sz w:val="22"/>
           <w:szCs w:val="22"/>
         </w:rPr>
-        <w:t xml:space="preserve">5. Hook: $349 a year. 100+ biomarkers. Two blood draws. A plan. Body: 77% of members found something new or interesting in their results or action plan. HSA/FSA eligible. CTA: Get 100+ biomarkers tested for $349</w:t>
+        <w:t xml:space="preserve">5. Hook: Your yearly checkup told you you were fine. Then what? Body: 93% of members rated their Superpower Health Action Plan as more useful or even life-changing compared to their yearly checkup. CTA: Get 100+ biomarkers tested for $349</w:t>
       </w:r>
     </w:p>
     <w:p>
@@ -529,20 +704,124 @@
           <w:sz w:val="28"/>
           <w:szCs w:val="28"/>
         </w:rPr>
-        <w:t xml:space="preserve">Short-form video — 22 seconds</w:t>
-      </w:r>
-    </w:p>
-    <w:p>
-      <w:pPr>
-        <w:spacing w:after="160"/>
-      </w:pPr>
-      <w:r>
-        <w:rPr>
-          <w:rFonts w:ascii="Calibri" w:cs="Calibri" w:eastAsia="Calibri" w:hAnsi="Calibri"/>
-          <w:sz w:val="22"/>
-          <w:szCs w:val="22"/>
-        </w:rPr>
-        <w:t xml:space="preserve">[Kitchen, morning, to camera] I left my physical proud. She said I was fine. Then I was still tired. Still guessing. Still calling a handful of markers a plan. Superpower is 100+ biomarkers. Twice a year. $349. 60% of members said Superpower identified something previously missed or overlooked by a doctor. Most companies stop at testing. We go further. [End card] Get 100+ biomarkers tested for $349</w:t>
+        <w:t xml:space="preserve">Short-form video — 18 seconds</w:t>
+      </w:r>
+    </w:p>
+    <w:p>
+      <w:pPr>
+        <w:spacing w:after="160"/>
+      </w:pPr>
+      <w:r>
+        <w:rPr>
+          <w:rFonts w:ascii="Calibri" w:cs="Calibri" w:eastAsia="Calibri" w:hAnsi="Calibri"/>
+          <w:sz w:val="22"/>
+          <w:szCs w:val="22"/>
+        </w:rPr>
+        <w:t xml:space="preserve">[To camera. Car, after the appointment. Printout on the passenger seat.]</w:t>
+      </w:r>
+    </w:p>
+    <w:p>
+      <w:pPr>
+        <w:spacing w:after="160"/>
+      </w:pPr>
+      <w:r>
+        <w:rPr>
+          <w:rFonts w:ascii="Calibri" w:cs="Calibri" w:eastAsia="Calibri" w:hAnsi="Calibri"/>
+          <w:sz w:val="22"/>
+          <w:szCs w:val="22"/>
+        </w:rPr>
+        <w:t xml:space="preserve">She said I was fine.</w:t>
+      </w:r>
+    </w:p>
+    <w:p>
+      <w:pPr>
+        <w:spacing w:after="160"/>
+      </w:pPr>
+      <w:r>
+        <w:rPr>
+          <w:rFonts w:ascii="Calibri" w:cs="Calibri" w:eastAsia="Calibri" w:hAnsi="Calibri"/>
+          <w:sz w:val="22"/>
+          <w:szCs w:val="22"/>
+        </w:rPr>
+        <w:t xml:space="preserve">[Beat. Holds up the short printout.]</w:t>
+      </w:r>
+    </w:p>
+    <w:p>
+      <w:pPr>
+        <w:spacing w:after="160"/>
+      </w:pPr>
+      <w:r>
+        <w:rPr>
+          <w:rFonts w:ascii="Calibri" w:cs="Calibri" w:eastAsia="Calibri" w:hAnsi="Calibri"/>
+          <w:sz w:val="22"/>
+          <w:szCs w:val="22"/>
+        </w:rPr>
+        <w:t xml:space="preserve">That was maybe 15 markers.</w:t>
+      </w:r>
+    </w:p>
+    <w:p>
+      <w:pPr>
+        <w:spacing w:after="160"/>
+      </w:pPr>
+      <w:r>
+        <w:rPr>
+          <w:rFonts w:ascii="Calibri" w:cs="Calibri" w:eastAsia="Calibri" w:hAnsi="Calibri"/>
+          <w:sz w:val="22"/>
+          <w:szCs w:val="22"/>
+        </w:rPr>
+        <w:t xml:space="preserve">I wanted the rest of the picture.</w:t>
+      </w:r>
+    </w:p>
+    <w:p>
+      <w:pPr>
+        <w:spacing w:after="160"/>
+      </w:pPr>
+      <w:r>
+        <w:rPr>
+          <w:rFonts w:ascii="Calibri" w:cs="Calibri" w:eastAsia="Calibri" w:hAnsi="Calibri"/>
+          <w:sz w:val="22"/>
+          <w:szCs w:val="22"/>
+        </w:rPr>
+        <w:t xml:space="preserve">Superpower. 100+ biomarkers. Twice a year. $349.</w:t>
+      </w:r>
+    </w:p>
+    <w:p>
+      <w:pPr>
+        <w:spacing w:after="160"/>
+      </w:pPr>
+      <w:r>
+        <w:rPr>
+          <w:rFonts w:ascii="Calibri" w:cs="Calibri" w:eastAsia="Calibri" w:hAnsi="Calibri"/>
+          <w:sz w:val="22"/>
+          <w:szCs w:val="22"/>
+        </w:rPr>
+        <w:t xml:space="preserve">60% of members said Superpower identified something previously missed or overlooked by a doctor.</w:t>
+      </w:r>
+    </w:p>
+    <w:p>
+      <w:pPr>
+        <w:spacing w:after="160"/>
+      </w:pPr>
+      <w:r>
+        <w:rPr>
+          <w:rFonts w:ascii="Calibri" w:cs="Calibri" w:eastAsia="Calibri" w:hAnsi="Calibri"/>
+          <w:sz w:val="22"/>
+          <w:szCs w:val="22"/>
+        </w:rPr>
+        <w:t xml:space="preserve">Most companies stop at testing. We go further.</w:t>
+      </w:r>
+    </w:p>
+    <w:p>
+      <w:pPr>
+        <w:spacing w:after="160"/>
+      </w:pPr>
+      <w:r>
+        <w:rPr>
+          <w:rFonts w:ascii="Calibri" w:cs="Calibri" w:eastAsia="Calibri" w:hAnsi="Calibri"/>
+          <w:sz w:val="22"/>
+          <w:szCs w:val="22"/>
+        </w:rPr>
+        <w:t xml:space="preserve">[End card] Get 100+ biomarkers tested for $349</w:t>
       </w:r>
     </w:p>
     <w:p>
@@ -564,43 +843,56 @@
     <w:p>
       <w:pPr>
         <w:spacing w:after="160"/>
-      </w:pPr>
-      <w:r>
-        <w:rPr>
-          <w:rFonts w:ascii="Calibri" w:cs="Calibri" w:eastAsia="Calibri" w:hAnsi="Calibri"/>
-          <w:sz w:val="22"/>
-          <w:szCs w:val="22"/>
-        </w:rPr>
-        <w:t xml:space="preserve">I’d keep the territory. I’d change the enemy. “Your annual physical isn’t enough” can read as “your doctor isn’t enough,” which makes this audience defend the one relationship they already trust. The sharper fight is with the question the physical asks: pass/fail versus a picture. Punch “fine,” not the physician. I’d also lock $349 and two blood draws in every performance unit — mixed pricing will leak into comments and kill the offer. Don’t name competitors. Specificity is the ad.</w:t>
-      </w:r>
-    </w:p>
-    <w:p>
-      <w:pPr>
-        <w:pStyle w:val="Heading1"/>
-        <w:spacing w:after="120" w:before="280"/>
-      </w:pPr>
-      <w:r>
-        <w:rPr>
-          <w:rFonts w:ascii="Calibri" w:cs="Calibri" w:eastAsia="Calibri" w:hAnsi="Calibri"/>
-          <w:b/>
-          <w:bCs/>
-          <w:sz w:val="28"/>
-          <w:szCs w:val="28"/>
-        </w:rPr>
-        <w:t xml:space="preserve">Guardrail pass</w:t>
-      </w:r>
-    </w:p>
-    <w:p>
-      <w:pPr>
-        <w:spacing w:after="160"/>
-      </w:pPr>
-      <w:r>
-        <w:rPr>
-          <w:rFonts w:ascii="Calibri" w:cs="Calibri" w:eastAsia="Calibri" w:hAnsi="Calibri"/>
-          <w:sz w:val="22"/>
-          <w:szCs w:val="22"/>
-        </w:rPr>
-        <w:t xml:space="preserve">No disease-prevention, curing, treating, diagnosing, or health-fixing claims. Biomarkers, never the banned testing phrasing. Care team, never the clinical/medical variants. On-demand, never round-the-clock clinician access. Stats copied verbatim from the approved bank. No paraphrased testimonials. No member census. Comparative without naming anyone in the category. Puffery used only as the approved tagline.</w:t>
+        <w:rPr>
+          <w:i/>
+          <w:iCs/>
+          <w:sz w:val="20"/>
+          <w:szCs w:val="20"/>
+        </w:rPr>
+      </w:pPr>
+      <w:r>
+        <w:rPr>
+          <w:rFonts w:ascii="Calibri" w:cs="Calibri" w:eastAsia="Calibri" w:hAnsi="Calibri"/>
+          <w:i/>
+          <w:iCs/>
+          <w:sz w:val="20"/>
+          <w:szCs w:val="20"/>
+        </w:rPr>
+        <w:t xml:space="preserve">100 words max.</w:t>
+      </w:r>
+    </w:p>
+    <w:p>
+      <w:pPr>
+        <w:spacing w:after="160"/>
+      </w:pPr>
+      <w:r>
+        <w:rPr>
+          <w:rFonts w:ascii="Calibri" w:cs="Calibri" w:eastAsia="Calibri" w:hAnsi="Calibri"/>
+          <w:sz w:val="22"/>
+          <w:szCs w:val="22"/>
+        </w:rPr>
+        <w:t xml:space="preserve">I’d keep the territory. I’d change the enemy. “Your annual physical isn’t enough” can read as “your doctor isn’t enough,” which makes this audience defend the one relationship they already trust. The sharper fight is the question the physical asks: pass/fail versus a picture. Punch “fine,” not the physician. Lead proof with the 93% Action Plan vs. checkup stat — it is the territory, in a number. Lock $349 and two blood draws in every performance unit.</w:t>
+      </w:r>
+    </w:p>
+    <w:p>
+      <w:pPr>
+        <w:spacing w:after="160"/>
+        <w:rPr>
+          <w:i/>
+          <w:iCs/>
+          <w:sz w:val="20"/>
+          <w:szCs w:val="20"/>
+        </w:rPr>
+      </w:pPr>
+      <w:r>
+        <w:rPr>
+          <w:rFonts w:ascii="Calibri" w:cs="Calibri" w:eastAsia="Calibri" w:hAnsi="Calibri"/>
+          <w:i/>
+          <w:iCs/>
+          <w:sz w:val="20"/>
+          <w:szCs w:val="20"/>
+        </w:rPr>
+        <w:t xml:space="preserve">80 words.</w:t>
       </w:r>
     </w:p>
     <w:sectPr>

</xml_diff>